<commit_message>
Rename project to College Canteen Pre-Ordering App in Project_Abstract_Campus_Food_PreOrdering.docx
Co-Authored-By: Claude Sonnet 5.5 <noreply@anthropic.com>
</commit_message>
<xml_diff>
--- a/Project_Abstract_Campus_Food_PreOrdering.docx
+++ b/Project_Abstract_Campus_Food_PreOrdering.docx
@@ -190,7 +190,49 @@
           <w:sz w:val="28"/>
           <w:szCs w:val="28"/>
         </w:rPr>
-        <w:t>[COURSE NAME] – ([COURSE CODE])                            A.Y. 2026 - 2027</w:t>
+        <w:t>[</w:t>
+      </w:r>
+      <w:r>
+        <w:rPr>
+          <w:rFonts w:hint="default" w:ascii="Times New Roman" w:hAnsi="Times New Roman" w:cs="Times New Roman"/>
+          <w:b/>
+          <w:bCs/>
+          <w:sz w:val="28"/>
+          <w:szCs w:val="28"/>
+          <w:lang w:val="en-US"/>
+        </w:rPr>
+        <w:t>SOA Programming</w:t>
+      </w:r>
+      <w:r>
+        <w:rPr>
+          <w:rFonts w:ascii="Times New Roman" w:hAnsi="Times New Roman" w:cs="Times New Roman"/>
+          <w:b/>
+          <w:bCs/>
+          <w:sz w:val="28"/>
+          <w:szCs w:val="28"/>
+        </w:rPr>
+        <w:t>] – ([</w:t>
+      </w:r>
+      <w:r>
+        <w:rPr>
+          <w:rFonts w:hint="default" w:ascii="Times New Roman" w:hAnsi="Times New Roman" w:cs="Times New Roman"/>
+          <w:b/>
+          <w:bCs/>
+          <w:sz w:val="28"/>
+          <w:szCs w:val="28"/>
+          <w:lang w:val="en-US"/>
+        </w:rPr>
+        <w:t>24SDCS03</w:t>
+      </w:r>
+      <w:r>
+        <w:rPr>
+          <w:rFonts w:ascii="Times New Roman" w:hAnsi="Times New Roman" w:cs="Times New Roman"/>
+          <w:b/>
+          <w:bCs/>
+          <w:sz w:val="28"/>
+          <w:szCs w:val="28"/>
+        </w:rPr>
+        <w:t>])              A.Y. 2026 - 2027</w:t>
       </w:r>
     </w:p>
     <w:tbl>
@@ -220,6 +262,22 @@
         <w:gridCol w:w="5493"/>
       </w:tblGrid>
       <w:tr>
+        <w:tblPrEx>
+          <w:tblBorders>
+            <w:top w:val="single" w:color="auto" w:sz="4" w:space="0"/>
+            <w:left w:val="single" w:color="auto" w:sz="4" w:space="0"/>
+            <w:bottom w:val="single" w:color="auto" w:sz="4" w:space="0"/>
+            <w:right w:val="single" w:color="auto" w:sz="4" w:space="0"/>
+            <w:insideH w:val="single" w:color="auto" w:sz="4" w:space="0"/>
+            <w:insideV w:val="single" w:color="auto" w:sz="4" w:space="0"/>
+          </w:tblBorders>
+          <w:tblCellMar>
+            <w:top w:w="0" w:type="dxa"/>
+            <w:left w:w="108" w:type="dxa"/>
+            <w:bottom w:w="0" w:type="dxa"/>
+            <w:right w:w="108" w:type="dxa"/>
+          </w:tblCellMar>
+        </w:tblPrEx>
         <w:trPr>
           <w:trHeight w:val="668" w:hRule="atLeast"/>
           <w:jc w:val="center"/>
@@ -269,7 +327,7 @@
                 <w:b/>
                 <w:bCs/>
               </w:rPr>
-              <w:t>Food and Delivery: Campus Food Pre-Ordering</w:t>
+              <w:t>College Canteen Pre-Ordering App</w:t>
             </w:r>
           </w:p>
           <w:p>
@@ -286,6 +344,22 @@
         </w:tc>
       </w:tr>
       <w:tr>
+        <w:tblPrEx>
+          <w:tblBorders>
+            <w:top w:val="single" w:color="auto" w:sz="4" w:space="0"/>
+            <w:left w:val="single" w:color="auto" w:sz="4" w:space="0"/>
+            <w:bottom w:val="single" w:color="auto" w:sz="4" w:space="0"/>
+            <w:right w:val="single" w:color="auto" w:sz="4" w:space="0"/>
+            <w:insideH w:val="single" w:color="auto" w:sz="4" w:space="0"/>
+            <w:insideV w:val="single" w:color="auto" w:sz="4" w:space="0"/>
+          </w:tblBorders>
+          <w:tblCellMar>
+            <w:top w:w="0" w:type="dxa"/>
+            <w:left w:w="108" w:type="dxa"/>
+            <w:bottom w:w="0" w:type="dxa"/>
+            <w:right w:w="108" w:type="dxa"/>
+          </w:tblCellMar>
+        </w:tblPrEx>
         <w:trPr>
           <w:trHeight w:val="228" w:hRule="atLeast"/>
           <w:jc w:val="center"/>
@@ -364,6 +438,22 @@
         </w:tc>
       </w:tr>
       <w:tr>
+        <w:tblPrEx>
+          <w:tblBorders>
+            <w:top w:val="single" w:color="auto" w:sz="4" w:space="0"/>
+            <w:left w:val="single" w:color="auto" w:sz="4" w:space="0"/>
+            <w:bottom w:val="single" w:color="auto" w:sz="4" w:space="0"/>
+            <w:right w:val="single" w:color="auto" w:sz="4" w:space="0"/>
+            <w:insideH w:val="single" w:color="auto" w:sz="4" w:space="0"/>
+            <w:insideV w:val="single" w:color="auto" w:sz="4" w:space="0"/>
+          </w:tblBorders>
+          <w:tblCellMar>
+            <w:top w:w="0" w:type="dxa"/>
+            <w:left w:w="108" w:type="dxa"/>
+            <w:bottom w:w="0" w:type="dxa"/>
+            <w:right w:w="108" w:type="dxa"/>
+          </w:tblCellMar>
+        </w:tblPrEx>
         <w:trPr>
           <w:trHeight w:val="228" w:hRule="atLeast"/>
           <w:jc w:val="center"/>
@@ -434,6 +524,22 @@
         </w:tc>
       </w:tr>
       <w:tr>
+        <w:tblPrEx>
+          <w:tblBorders>
+            <w:top w:val="single" w:color="auto" w:sz="4" w:space="0"/>
+            <w:left w:val="single" w:color="auto" w:sz="4" w:space="0"/>
+            <w:bottom w:val="single" w:color="auto" w:sz="4" w:space="0"/>
+            <w:right w:val="single" w:color="auto" w:sz="4" w:space="0"/>
+            <w:insideH w:val="single" w:color="auto" w:sz="4" w:space="0"/>
+            <w:insideV w:val="single" w:color="auto" w:sz="4" w:space="0"/>
+          </w:tblBorders>
+          <w:tblCellMar>
+            <w:top w:w="0" w:type="dxa"/>
+            <w:left w:w="108" w:type="dxa"/>
+            <w:bottom w:w="0" w:type="dxa"/>
+            <w:right w:w="108" w:type="dxa"/>
+          </w:tblCellMar>
+        </w:tblPrEx>
         <w:trPr>
           <w:trHeight w:val="228" w:hRule="atLeast"/>
           <w:jc w:val="center"/>
@@ -504,8 +610,24 @@
         </w:tc>
       </w:tr>
       <w:tr>
+        <w:tblPrEx>
+          <w:tblBorders>
+            <w:top w:val="single" w:color="auto" w:sz="4" w:space="0"/>
+            <w:left w:val="single" w:color="auto" w:sz="4" w:space="0"/>
+            <w:bottom w:val="single" w:color="auto" w:sz="4" w:space="0"/>
+            <w:right w:val="single" w:color="auto" w:sz="4" w:space="0"/>
+            <w:insideH w:val="single" w:color="auto" w:sz="4" w:space="0"/>
+            <w:insideV w:val="single" w:color="auto" w:sz="4" w:space="0"/>
+          </w:tblBorders>
+          <w:tblCellMar>
+            <w:top w:w="0" w:type="dxa"/>
+            <w:left w:w="108" w:type="dxa"/>
+            <w:bottom w:w="0" w:type="dxa"/>
+            <w:right w:w="108" w:type="dxa"/>
+          </w:tblCellMar>
+        </w:tblPrEx>
         <w:trPr>
-          <w:trHeight w:val="228" w:hRule="atLeast"/>
+          <w:trHeight w:val="277" w:hRule="atLeast"/>
           <w:jc w:val="center"/>
         </w:trPr>
         <w:tc>
@@ -574,28 +696,67 @@
         </w:tc>
       </w:tr>
       <w:tr>
+        <w:tblPrEx>
+          <w:tblBorders>
+            <w:top w:val="single" w:color="auto" w:sz="4" w:space="0"/>
+            <w:left w:val="single" w:color="auto" w:sz="4" w:space="0"/>
+            <w:bottom w:val="single" w:color="auto" w:sz="4" w:space="0"/>
+            <w:right w:val="single" w:color="auto" w:sz="4" w:space="0"/>
+            <w:insideH w:val="single" w:color="auto" w:sz="4" w:space="0"/>
+            <w:insideV w:val="single" w:color="auto" w:sz="4" w:space="0"/>
+          </w:tblBorders>
+          <w:tblCellMar>
+            <w:top w:w="0" w:type="dxa"/>
+            <w:left w:w="108" w:type="dxa"/>
+            <w:bottom w:w="0" w:type="dxa"/>
+            <w:right w:w="108" w:type="dxa"/>
+          </w:tblCellMar>
+        </w:tblPrEx>
         <w:trPr>
-          <w:trHeight w:val="236" w:hRule="atLeast"/>
+          <w:trHeight w:val="277" w:hRule="atLeast"/>
           <w:jc w:val="center"/>
         </w:trPr>
         <w:tc>
           <w:tcPr>
-            <w:tcW w:w="4406" w:type="dxa"/>
-            <w:gridSpan w:val="2"/>
+            <w:tcW w:w="1448" w:type="dxa"/>
           </w:tcPr>
           <w:p>
             <w:pPr>
               <w:spacing w:after="0" w:line="240" w:lineRule="auto"/>
               <w:jc w:val="center"/>
               <w:rPr>
-                <w:rFonts w:ascii="Times New Roman" w:hAnsi="Times New Roman" w:cs="Times New Roman"/>
+                <w:rFonts w:hint="default" w:ascii="Times New Roman" w:hAnsi="Times New Roman" w:cs="Times New Roman"/>
+                <w:lang w:val="en-US"/>
               </w:rPr>
             </w:pPr>
             <w:r>
               <w:rPr>
-                <w:rFonts w:ascii="Times New Roman" w:hAnsi="Times New Roman" w:cs="Times New Roman"/>
-              </w:rPr>
-              <w:t>Name of the Guide</w:t>
+                <w:rFonts w:hint="default" w:ascii="Times New Roman" w:hAnsi="Times New Roman" w:cs="Times New Roman"/>
+                <w:lang w:val="en-US"/>
+              </w:rPr>
+              <w:t>4</w:t>
+            </w:r>
+          </w:p>
+        </w:tc>
+        <w:tc>
+          <w:tcPr>
+            <w:tcW w:w="2958" w:type="dxa"/>
+          </w:tcPr>
+          <w:p>
+            <w:pPr>
+              <w:spacing w:after="0" w:line="240" w:lineRule="auto"/>
+              <w:jc w:val="center"/>
+              <w:rPr>
+                <w:rFonts w:hint="default" w:ascii="Times New Roman" w:hAnsi="Times New Roman" w:cs="Times New Roman"/>
+                <w:lang w:val="en-US"/>
+              </w:rPr>
+            </w:pPr>
+            <w:r>
+              <w:rPr>
+                <w:rFonts w:hint="default" w:ascii="Times New Roman" w:hAnsi="Times New Roman" w:cs="Times New Roman"/>
+                <w:lang w:val="en-US"/>
+              </w:rPr>
+              <w:t>2400032486</w:t>
             </w:r>
           </w:p>
         </w:tc>
@@ -609,9 +770,87 @@
               <w:jc w:val="center"/>
               <w:rPr>
                 <w:rFonts w:hint="default" w:ascii="Times New Roman" w:hAnsi="Times New Roman" w:cs="Times New Roman"/>
+                <w:lang w:val="en-US"/>
+              </w:rPr>
+            </w:pPr>
+            <w:r>
+              <w:rPr>
+                <w:rFonts w:hint="default" w:ascii="Times New Roman" w:hAnsi="Times New Roman" w:cs="Times New Roman"/>
+                <w:lang w:val="en-US"/>
+              </w:rPr>
+              <w:t xml:space="preserve">R Sai Sidhartha </w:t>
+            </w:r>
+          </w:p>
+        </w:tc>
+      </w:tr>
+      <w:tr>
+        <w:tblPrEx>
+          <w:tblBorders>
+            <w:top w:val="single" w:color="auto" w:sz="4" w:space="0"/>
+            <w:left w:val="single" w:color="auto" w:sz="4" w:space="0"/>
+            <w:bottom w:val="single" w:color="auto" w:sz="4" w:space="0"/>
+            <w:right w:val="single" w:color="auto" w:sz="4" w:space="0"/>
+            <w:insideH w:val="single" w:color="auto" w:sz="4" w:space="0"/>
+            <w:insideV w:val="single" w:color="auto" w:sz="4" w:space="0"/>
+          </w:tblBorders>
+          <w:tblCellMar>
+            <w:top w:w="0" w:type="dxa"/>
+            <w:left w:w="108" w:type="dxa"/>
+            <w:bottom w:w="0" w:type="dxa"/>
+            <w:right w:w="108" w:type="dxa"/>
+          </w:tblCellMar>
+        </w:tblPrEx>
+        <w:trPr>
+          <w:trHeight w:val="236" w:hRule="atLeast"/>
+          <w:jc w:val="center"/>
+        </w:trPr>
+        <w:tc>
+          <w:tcPr>
+            <w:tcW w:w="4406" w:type="dxa"/>
+            <w:gridSpan w:val="2"/>
+            <w:shd w:val="clear"/>
+            <w:vAlign w:val="top"/>
+          </w:tcPr>
+          <w:p>
+            <w:pPr>
+              <w:spacing w:after="0" w:line="240" w:lineRule="auto"/>
+              <w:jc w:val="center"/>
+              <w:rPr>
+                <w:rFonts w:ascii="Times New Roman" w:hAnsi="Times New Roman" w:cs="Times New Roman" w:eastAsiaTheme="minorHAnsi"/>
+                <w:kern w:val="2"/>
+                <w:sz w:val="24"/>
+                <w:szCs w:val="24"/>
+                <w:lang w:val="en-US" w:eastAsia="en-US" w:bidi="ar-SA"/>
+                <w14:ligatures w14:val="standardContextual"/>
+              </w:rPr>
+            </w:pPr>
+            <w:r>
+              <w:rPr>
+                <w:rFonts w:ascii="Times New Roman" w:hAnsi="Times New Roman" w:cs="Times New Roman"/>
+              </w:rPr>
+              <w:t>Name of the Guide</w:t>
+            </w:r>
+          </w:p>
+        </w:tc>
+        <w:tc>
+          <w:tcPr>
+            <w:tcW w:w="5493" w:type="dxa"/>
+            <w:shd w:val="clear"/>
+            <w:vAlign w:val="top"/>
+          </w:tcPr>
+          <w:p>
+            <w:pPr>
+              <w:spacing w:after="0" w:line="240" w:lineRule="auto"/>
+              <w:jc w:val="center"/>
+              <w:rPr>
+                <w:rFonts w:hint="default" w:ascii="Times New Roman" w:hAnsi="Times New Roman" w:cs="Times New Roman" w:eastAsiaTheme="minorHAnsi"/>
                 <w:b/>
                 <w:bCs/>
-                <w:lang w:val="en-US"/>
+                <w:kern w:val="2"/>
+                <w:sz w:val="24"/>
+                <w:szCs w:val="24"/>
+                <w:lang w:val="en-US" w:eastAsia="en-US" w:bidi="ar-SA"/>
+                <w14:ligatures w14:val="standardContextual"/>
               </w:rPr>
             </w:pPr>
             <w:r>
@@ -676,13 +915,23 @@
           <w:b/>
           <w:bCs/>
         </w:rPr>
-        <w:t>Campus canteens and food courts often turn short lunch and evening breaks into long, frustrating waits.</w:t>
-      </w:r>
-      <w:r>
-        <w:rPr>
-          <w:rFonts w:ascii="Times New Roman" w:hAnsi="Times New Roman" w:cs="Times New Roman"/>
-        </w:rPr>
-        <w:t xml:space="preserve"> Students queue for ten to twenty minutes just to place an order, kitchens receive orders unevenly through the day, and prepared food is frequently left uncollected, wasting both time and food. Cash-heavy, walk-up ordering also makes it hard for canteen staff to plan preparation in advance or track demand across menu items. These pain points motivate the Campus Food Pre-Ordering platform, a web application that lets students browse live menus, place and pay for orders in advance, and collect food at a scheduled slot with little to no wait.</w:t>
+        <w:t xml:space="preserve">Campus canteens and food courts often turn short lunch and evening breaks into long, </w:t>
+      </w:r>
+      <w:bookmarkStart w:id="0" w:name="_GoBack"/>
+      <w:bookmarkEnd w:id="0"/>
+      <w:r>
+        <w:rPr>
+          <w:rFonts w:ascii="Times New Roman" w:hAnsi="Times New Roman" w:cs="Times New Roman"/>
+          <w:b/>
+          <w:bCs/>
+        </w:rPr>
+        <w:t>frustrating waits.</w:t>
+      </w:r>
+      <w:r>
+        <w:rPr>
+          <w:rFonts w:ascii="Times New Roman" w:hAnsi="Times New Roman" w:cs="Times New Roman"/>
+        </w:rPr>
+        <w:t xml:space="preserve"> Students queue for ten to twenty minutes just to place an order, kitchens receive orders unevenly through the day, and prepared food is frequently left uncollected, wasting both time and food. Cash-heavy, walk-up ordering also makes it hard for canteen staff to plan preparation in advance or track demand across menu items. These pain points motivate the College Canteen Pre-Ordering App, a web application that lets students browse live menus, place and pay for orders in advance, and collect food at a scheduled slot with little to no wait.</w:t>
       </w:r>
     </w:p>
     <w:p>
@@ -1078,7 +1327,7 @@
     <w:lsdException w:qFormat="1" w:unhideWhenUsed="0" w:uiPriority="10" w:semiHidden="0" w:name="Title"/>
     <w:lsdException w:uiPriority="99" w:name="Closing"/>
     <w:lsdException w:uiPriority="99" w:name="Signature"/>
-    <w:lsdException w:uiPriority="1" w:semiHidden="0" w:name="Default Paragraph Font"/>
+    <w:lsdException w:qFormat="1" w:uiPriority="1" w:semiHidden="0" w:name="Default Paragraph Font"/>
     <w:lsdException w:uiPriority="99" w:name="Body Text"/>
     <w:lsdException w:uiPriority="99" w:name="Body Text Indent"/>
     <w:lsdException w:uiPriority="99" w:name="List Continue"/>
@@ -1116,7 +1365,7 @@
     <w:lsdException w:uiPriority="99" w:name="HTML Sample"/>
     <w:lsdException w:uiPriority="99" w:name="HTML Typewriter"/>
     <w:lsdException w:uiPriority="99" w:name="HTML Variable"/>
-    <w:lsdException w:uiPriority="99" w:name="Normal Table"/>
+    <w:lsdException w:qFormat="1" w:uiPriority="99" w:name="Normal Table"/>
     <w:lsdException w:uiPriority="99" w:name="annotation subject"/>
     <w:lsdException w:uiPriority="99" w:name="Table Simple 1"/>
     <w:lsdException w:uiPriority="99" w:name="Table Simple 2"/>
@@ -1161,7 +1410,7 @@
     <w:lsdException w:uiPriority="99" w:name="Table Web 2"/>
     <w:lsdException w:uiPriority="99" w:name="Table Web 3"/>
     <w:lsdException w:uiPriority="99" w:name="Balloon Text"/>
-    <w:lsdException w:unhideWhenUsed="0" w:uiPriority="39" w:semiHidden="0" w:name="Table Grid"/>
+    <w:lsdException w:qFormat="1" w:unhideWhenUsed="0" w:uiPriority="39" w:semiHidden="0" w:name="Table Grid"/>
     <w:lsdException w:uiPriority="99" w:name="Table Theme"/>
     <w:lsdException w:unhideWhenUsed="0" w:uiPriority="60" w:semiHidden="0" w:name="Light Shading"/>
     <w:lsdException w:unhideWhenUsed="0" w:uiPriority="61" w:semiHidden="0" w:name="Light List"/>
@@ -1506,12 +1755,14 @@
   <w:style w:type="character" w:default="1" w:styleId="11">
     <w:name w:val="Default Paragraph Font"/>
     <w:unhideWhenUsed/>
+    <w:qFormat/>
     <w:uiPriority w:val="1"/>
   </w:style>
   <w:style w:type="table" w:default="1" w:styleId="12">
     <w:name w:val="Normal Table"/>
     <w:semiHidden/>
     <w:unhideWhenUsed/>
+    <w:qFormat/>
     <w:uiPriority w:val="99"/>
     <w:tblPr>
       <w:tblCellMar>
@@ -1548,6 +1799,7 @@
   <w:style w:type="table" w:styleId="14">
     <w:name w:val="Table Grid"/>
     <w:basedOn w:val="12"/>
+    <w:qFormat/>
     <w:uiPriority w:val="39"/>
     <w:pPr>
       <w:spacing w:after="0" w:line="240" w:lineRule="auto"/>
@@ -1586,6 +1838,7 @@
     <w:name w:val="Heading 1 Char"/>
     <w:basedOn w:val="11"/>
     <w:link w:val="2"/>
+    <w:qFormat/>
     <w:uiPriority w:val="9"/>
     <w:rPr>
       <w:rFonts w:asciiTheme="majorHAnsi" w:hAnsiTheme="majorHAnsi" w:eastAsiaTheme="majorEastAsia" w:cstheme="majorBidi"/>
@@ -1599,6 +1852,7 @@
     <w:basedOn w:val="11"/>
     <w:link w:val="3"/>
     <w:semiHidden/>
+    <w:qFormat/>
     <w:uiPriority w:val="9"/>
     <w:rPr>
       <w:rFonts w:asciiTheme="majorHAnsi" w:hAnsiTheme="majorHAnsi" w:eastAsiaTheme="majorEastAsia" w:cstheme="majorBidi"/>
@@ -1612,6 +1866,7 @@
     <w:basedOn w:val="11"/>
     <w:link w:val="4"/>
     <w:semiHidden/>
+    <w:qFormat/>
     <w:uiPriority w:val="9"/>
     <w:rPr>
       <w:rFonts w:eastAsiaTheme="majorEastAsia" w:cstheme="majorBidi"/>
@@ -1625,6 +1880,7 @@
     <w:basedOn w:val="11"/>
     <w:link w:val="5"/>
     <w:semiHidden/>
+    <w:qFormat/>
     <w:uiPriority w:val="9"/>
     <w:rPr>
       <w:rFonts w:eastAsiaTheme="majorEastAsia" w:cstheme="majorBidi"/>
@@ -1638,6 +1894,7 @@
     <w:basedOn w:val="11"/>
     <w:link w:val="6"/>
     <w:semiHidden/>
+    <w:qFormat/>
     <w:uiPriority w:val="9"/>
     <w:rPr>
       <w:rFonts w:eastAsiaTheme="majorEastAsia" w:cstheme="majorBidi"/>
@@ -1649,6 +1906,7 @@
     <w:basedOn w:val="11"/>
     <w:link w:val="7"/>
     <w:semiHidden/>
+    <w:qFormat/>
     <w:uiPriority w:val="9"/>
     <w:rPr>
       <w:rFonts w:eastAsiaTheme="majorEastAsia" w:cstheme="majorBidi"/>
@@ -1670,6 +1928,7 @@
     <w:basedOn w:val="11"/>
     <w:link w:val="8"/>
     <w:semiHidden/>
+    <w:qFormat/>
     <w:uiPriority w:val="9"/>
     <w:rPr>
       <w:rFonts w:eastAsiaTheme="majorEastAsia" w:cstheme="majorBidi"/>
@@ -1689,6 +1948,7 @@
     <w:basedOn w:val="11"/>
     <w:link w:val="9"/>
     <w:semiHidden/>
+    <w:qFormat/>
     <w:uiPriority w:val="9"/>
     <w:rPr>
       <w:rFonts w:eastAsiaTheme="majorEastAsia" w:cstheme="majorBidi"/>
@@ -1710,6 +1970,7 @@
     <w:basedOn w:val="11"/>
     <w:link w:val="10"/>
     <w:semiHidden/>
+    <w:qFormat/>
     <w:uiPriority w:val="9"/>
     <w:rPr>
       <w:rFonts w:eastAsiaTheme="majorEastAsia" w:cstheme="majorBidi"/>
@@ -1728,6 +1989,7 @@
     <w:name w:val="Title Char"/>
     <w:basedOn w:val="11"/>
     <w:link w:val="15"/>
+    <w:qFormat/>
     <w:uiPriority w:val="10"/>
     <w:rPr>
       <w:rFonts w:asciiTheme="majorHAnsi" w:hAnsiTheme="majorHAnsi" w:eastAsiaTheme="majorEastAsia" w:cstheme="majorBidi"/>

</xml_diff>